<commit_message>
changes for PPT and DOCX export
</commit_message>
<xml_diff>
--- a/backend/template/NTT_DATA_Master_Templates.docx
+++ b/backend/template/NTT_DATA_Master_Templates.docx
@@ -78,8 +78,18 @@
               <w:pStyle w:val="Heading2"/>
               <w:spacing w:line="240" w:lineRule="auto"/>
             </w:pPr>
-            <w:r>
-              <w:t>{{ fullName }}</w:t>
+            <w:proofErr w:type="gramStart"/>
+            <w:r>
+              <w:t xml:space="preserve">{{ </w:t>
+            </w:r>
+            <w:proofErr w:type="spellStart"/>
+            <w:r>
+              <w:t>fullName</w:t>
+            </w:r>
+            <w:proofErr w:type="spellEnd"/>
+            <w:proofErr w:type="gramEnd"/>
+            <w:r>
+              <w:t xml:space="preserve"> }}</w:t>
             </w:r>
             <w:r>
               <w:t xml:space="preserve"> </w:t>
@@ -89,12 +99,16 @@
             <w:pPr>
               <w:pStyle w:val="Heading2"/>
             </w:pPr>
+            <w:proofErr w:type="gramStart"/>
             <w:r>
               <w:t xml:space="preserve">{{ </w:t>
             </w:r>
+            <w:proofErr w:type="spellStart"/>
             <w:r>
               <w:t>jobTitle</w:t>
             </w:r>
+            <w:proofErr w:type="spellEnd"/>
+            <w:proofErr w:type="gramEnd"/>
             <w:r>
               <w:t xml:space="preserve"> </w:t>
             </w:r>
@@ -103,17 +117,24 @@
             </w:r>
           </w:p>
           <w:p>
-            <w:r>
-              <w:t>{{ email }}</w:t>
+            <w:proofErr w:type="gramStart"/>
+            <w:r>
+              <w:t>{{ email</w:t>
+            </w:r>
+            <w:proofErr w:type="gramEnd"/>
+            <w:r>
+              <w:t xml:space="preserve"> }}</w:t>
             </w:r>
           </w:p>
           <w:p>
+            <w:proofErr w:type="gramStart"/>
             <w:r>
               <w:t xml:space="preserve">{{ </w:t>
             </w:r>
             <w:r>
               <w:t>phone</w:t>
             </w:r>
+            <w:proofErr w:type="gramEnd"/>
             <w:r>
               <w:t xml:space="preserve"> }}</w:t>
             </w:r>
@@ -128,13 +149,23 @@
                 <w:szCs w:val="22"/>
               </w:rPr>
             </w:pPr>
+            <w:proofErr w:type="gramStart"/>
             <w:r>
               <w:rPr>
                 <w:rFonts w:ascii="Arial" w:hAnsi="Arial" w:cs="Arial"/>
                 <w:sz w:val="22"/>
                 <w:szCs w:val="22"/>
               </w:rPr>
-              <w:t>{{ location }}</w:t>
+              <w:t>{{ location</w:t>
+            </w:r>
+            <w:proofErr w:type="gramEnd"/>
+            <w:r>
+              <w:rPr>
+                <w:rFonts w:ascii="Arial" w:hAnsi="Arial" w:cs="Arial"/>
+                <w:sz w:val="22"/>
+                <w:szCs w:val="22"/>
+              </w:rPr>
+              <w:t xml:space="preserve"> }}</w:t>
             </w:r>
             <w:r>
               <w:rPr>
@@ -224,11 +255,21 @@
           </w:p>
           <w:p>
             <w:r>
-              <w:t xml:space="preserve">{%p for profSummary in </w:t>
-            </w:r>
+              <w:t xml:space="preserve">{%p for </w:t>
+            </w:r>
+            <w:proofErr w:type="spellStart"/>
+            <w:r>
+              <w:t>profSummary</w:t>
+            </w:r>
+            <w:proofErr w:type="spellEnd"/>
+            <w:r>
+              <w:t xml:space="preserve"> in </w:t>
+            </w:r>
+            <w:proofErr w:type="spellStart"/>
             <w:r>
               <w:t>professionalSummary</w:t>
             </w:r>
+            <w:proofErr w:type="spellEnd"/>
             <w:r>
               <w:t xml:space="preserve"> %}</w:t>
             </w:r>
@@ -247,13 +288,33 @@
                 <w:szCs w:val="22"/>
               </w:rPr>
             </w:pPr>
+            <w:proofErr w:type="gramStart"/>
             <w:r>
               <w:rPr>
                 <w:rFonts w:ascii="Arial" w:hAnsi="Arial" w:cs="Arial"/>
                 <w:sz w:val="22"/>
                 <w:szCs w:val="22"/>
               </w:rPr>
-              <w:t>{{ profSummary }}</w:t>
+              <w:t xml:space="preserve">{{ </w:t>
+            </w:r>
+            <w:proofErr w:type="spellStart"/>
+            <w:r>
+              <w:rPr>
+                <w:rFonts w:ascii="Arial" w:hAnsi="Arial" w:cs="Arial"/>
+                <w:sz w:val="22"/>
+                <w:szCs w:val="22"/>
+              </w:rPr>
+              <w:t>profSummary</w:t>
+            </w:r>
+            <w:proofErr w:type="spellEnd"/>
+            <w:proofErr w:type="gramEnd"/>
+            <w:r>
+              <w:rPr>
+                <w:rFonts w:ascii="Arial" w:hAnsi="Arial" w:cs="Arial"/>
+                <w:sz w:val="22"/>
+                <w:szCs w:val="22"/>
+              </w:rPr>
+              <w:t xml:space="preserve"> }}</w:t>
             </w:r>
           </w:p>
           <w:p>
@@ -271,8 +332,28 @@
                 <w:sz w:val="22"/>
                 <w:szCs w:val="22"/>
               </w:rPr>
-              <w:t>{%p endfor %}</w:t>
-            </w:r>
+              <w:t xml:space="preserve">{%p </w:t>
+            </w:r>
+            <w:proofErr w:type="spellStart"/>
+            <w:proofErr w:type="gramStart"/>
+            <w:r>
+              <w:rPr>
+                <w:rFonts w:ascii="Arial" w:hAnsi="Arial" w:cs="Arial"/>
+                <w:sz w:val="22"/>
+                <w:szCs w:val="22"/>
+              </w:rPr>
+              <w:t>endfor</w:t>
+            </w:r>
+            <w:proofErr w:type="spellEnd"/>
+            <w:r>
+              <w:rPr>
+                <w:rFonts w:ascii="Arial" w:hAnsi="Arial" w:cs="Arial"/>
+                <w:sz w:val="22"/>
+                <w:szCs w:val="22"/>
+              </w:rPr>
+              <w:t xml:space="preserve"> %}</w:t>
+            </w:r>
+            <w:proofErr w:type="gramEnd"/>
           </w:p>
           <w:p>
             <w:pPr>
@@ -308,13 +389,26 @@
                     <w:spacing w:before="0" w:after="0" w:line="240" w:lineRule="auto"/>
                   </w:pPr>
                   <w:r>
-                    <w:t>Application Experience</w:t>
+                    <w:t>Primary Skills</w:t>
                   </w:r>
                 </w:p>
                 <w:p>
                   <w:r>
-                    <w:t>{%p for skill in technicalSkills.primary%}</w:t>
+                    <w:t xml:space="preserve">{%p for skill in </w:t>
                   </w:r>
+                  <w:proofErr w:type="spellStart"/>
+                  <w:r>
+                    <w:t>technicalSkills.</w:t>
+                  </w:r>
+                  <w:proofErr w:type="gramStart"/>
+                  <w:r>
+                    <w:t>primary</w:t>
+                  </w:r>
+                  <w:proofErr w:type="spellEnd"/>
+                  <w:r>
+                    <w:t>%}</w:t>
+                  </w:r>
+                  <w:proofErr w:type="gramEnd"/>
                 </w:p>
                 <w:p>
                   <w:pPr>
@@ -324,53 +418,128 @@
                       <w:numId w:val="25"/>
                     </w:numPr>
                   </w:pPr>
+                  <w:proofErr w:type="gramStart"/>
                   <w:r>
-                    <w:t>{{ skill.skillName }} : {{ skill.proficiency }}</w:t>
+                    <w:t xml:space="preserve">{{ </w:t>
+                  </w:r>
+                  <w:proofErr w:type="spellStart"/>
+                  <w:r>
+                    <w:t>skill</w:t>
+                  </w:r>
+                  <w:proofErr w:type="gramEnd"/>
+                  <w:r>
+                    <w:t>.</w:t>
+                  </w:r>
+                  <w:proofErr w:type="gramStart"/>
+                  <w:r>
+                    <w:t>skillName</w:t>
+                  </w:r>
+                  <w:proofErr w:type="spellEnd"/>
+                  <w:r>
+                    <w:t xml:space="preserve"> }</w:t>
+                  </w:r>
+                  <w:proofErr w:type="gramEnd"/>
+                  <w:r>
+                    <w:t xml:space="preserve">} </w:t>
                   </w:r>
                 </w:p>
                 <w:p>
                   <w:r>
-                    <w:t>{%p endfor %}</w:t>
+                    <w:t xml:space="preserve">{%p </w:t>
                   </w:r>
+                  <w:proofErr w:type="spellStart"/>
+                  <w:proofErr w:type="gramStart"/>
+                  <w:r>
+                    <w:t>endfor</w:t>
+                  </w:r>
+                  <w:proofErr w:type="spellEnd"/>
+                  <w:r>
+                    <w:t xml:space="preserve"> %}</w:t>
+                  </w:r>
+                  <w:proofErr w:type="gramEnd"/>
+                </w:p>
+                <w:p>
+                  <w:pPr>
+                    <w:pStyle w:val="Heading2"/>
+                    <w:spacing w:before="0" w:after="0" w:line="240" w:lineRule="auto"/>
+                  </w:pPr>
+                  <w:r>
+                    <w:t>Secondary</w:t>
+                  </w:r>
+                  <w:r>
+                    <w:t xml:space="preserve"> Skills</w:t>
+                  </w:r>
+                </w:p>
+                <w:p>
+                  <w:r>
+                    <w:t xml:space="preserve">{%p for skill in </w:t>
+                  </w:r>
+                  <w:proofErr w:type="spellStart"/>
+                  <w:r>
+                    <w:t>technicalSkills.</w:t>
+                  </w:r>
+                  <w:proofErr w:type="gramStart"/>
+                  <w:r>
+                    <w:t>secondary</w:t>
+                  </w:r>
+                  <w:proofErr w:type="spellEnd"/>
+                  <w:r>
+                    <w:t>%}</w:t>
+                  </w:r>
+                  <w:proofErr w:type="gramEnd"/>
+                </w:p>
+                <w:p>
+                  <w:pPr>
+                    <w:pStyle w:val="ListParagraph"/>
+                    <w:numPr>
+                      <w:ilvl w:val="0"/>
+                      <w:numId w:val="25"/>
+                    </w:numPr>
+                  </w:pPr>
+                  <w:proofErr w:type="gramStart"/>
+                  <w:r>
+                    <w:t xml:space="preserve">{{ </w:t>
+                  </w:r>
+                  <w:proofErr w:type="spellStart"/>
+                  <w:r>
+                    <w:t>skill</w:t>
+                  </w:r>
+                  <w:proofErr w:type="gramEnd"/>
+                  <w:r>
+                    <w:t>.</w:t>
+                  </w:r>
+                  <w:proofErr w:type="gramStart"/>
+                  <w:r>
+                    <w:t>skillName</w:t>
+                  </w:r>
+                  <w:proofErr w:type="spellEnd"/>
+                  <w:r>
+                    <w:t xml:space="preserve"> }</w:t>
+                  </w:r>
+                  <w:proofErr w:type="gramEnd"/>
+                  <w:r>
+                    <w:t xml:space="preserve">} </w:t>
+                  </w:r>
+                </w:p>
+                <w:p>
+                  <w:r>
+                    <w:t xml:space="preserve">{%p </w:t>
+                  </w:r>
+                  <w:proofErr w:type="spellStart"/>
+                  <w:proofErr w:type="gramStart"/>
+                  <w:r>
+                    <w:t>endfor</w:t>
+                  </w:r>
+                  <w:proofErr w:type="spellEnd"/>
+                  <w:r>
+                    <w:t xml:space="preserve"> %}</w:t>
+                  </w:r>
+                  <w:proofErr w:type="gramEnd"/>
                 </w:p>
                 <w:p/>
               </w:tc>
             </w:tr>
           </w:tbl>
-          <w:p>
-            <w:pPr>
-              <w:pStyle w:val="Heading2"/>
-              <w:spacing w:before="0" w:after="0" w:line="240" w:lineRule="auto"/>
-            </w:pPr>
-            <w:r>
-              <w:t>Highlights</w:t>
-            </w:r>
-          </w:p>
-          <w:p>
-            <w:pPr>
-              <w:pStyle w:val="ListParagraph"/>
-              <w:numPr>
-                <w:ilvl w:val="0"/>
-                <w:numId w:val="1"/>
-              </w:numPr>
-              <w:spacing w:before="120" w:after="120" w:line="240" w:lineRule="auto"/>
-              <w:ind w:left="357" w:hanging="357"/>
-              <w:rPr>
-                <w:rFonts w:ascii="Arial" w:hAnsi="Arial" w:cs="Arial"/>
-                <w:color w:val="000000" w:themeColor="text1" w:themeShade="80"/>
-                <w:sz w:val="22"/>
-                <w:szCs w:val="22"/>
-              </w:rPr>
-            </w:pPr>
-            <w:r>
-              <w:rPr>
-                <w:rFonts w:ascii="Arial" w:hAnsi="Arial" w:cs="Arial"/>
-                <w:sz w:val="22"/>
-                <w:szCs w:val="22"/>
-              </w:rPr>
-              <w:t>{{ summary }}</w:t>
-            </w:r>
-          </w:p>
           <w:p>
             <w:pPr>
               <w:spacing w:after="0" w:line="240" w:lineRule="auto"/>
@@ -392,31 +561,226 @@
           </w:p>
           <w:p>
             <w:r>
-              <w:t>{%p for exp in experience %}}</w:t>
-            </w:r>
+              <w:t xml:space="preserve">{%p for exp in </w:t>
+            </w:r>
+            <w:proofErr w:type="gramStart"/>
+            <w:r>
+              <w:t>experience %}}</w:t>
+            </w:r>
+            <w:proofErr w:type="gramEnd"/>
           </w:p>
           <w:p>
             <w:r>
-              <w:t>Facility: {{ exp.company }}                                                        {{ exp.startDate }} – {{ exp.endDate }}</w:t>
+              <w:t xml:space="preserve">Facility: </w:t>
+            </w:r>
+            <w:proofErr w:type="gramStart"/>
+            <w:r>
+              <w:t xml:space="preserve">{{ </w:t>
+            </w:r>
+            <w:proofErr w:type="spellStart"/>
+            <w:r>
+              <w:t>exp</w:t>
+            </w:r>
+            <w:proofErr w:type="gramEnd"/>
+            <w:r>
+              <w:t>.</w:t>
+            </w:r>
+            <w:proofErr w:type="gramStart"/>
+            <w:r>
+              <w:t>company</w:t>
+            </w:r>
+            <w:proofErr w:type="spellEnd"/>
+            <w:r>
+              <w:t xml:space="preserve"> }</w:t>
+            </w:r>
+            <w:proofErr w:type="gramEnd"/>
+            <w:r>
+              <w:t xml:space="preserve">}                                                     </w:t>
+            </w:r>
+            <w:proofErr w:type="gramStart"/>
+            <w:r>
+              <w:t xml:space="preserve">   {{ </w:t>
+            </w:r>
+            <w:proofErr w:type="spellStart"/>
+            <w:r>
+              <w:t>exp</w:t>
+            </w:r>
+            <w:proofErr w:type="gramEnd"/>
+            <w:r>
+              <w:t>.</w:t>
+            </w:r>
+            <w:proofErr w:type="gramStart"/>
+            <w:r>
+              <w:t>startDate</w:t>
+            </w:r>
+            <w:proofErr w:type="spellEnd"/>
+            <w:r>
+              <w:t xml:space="preserve"> }</w:t>
+            </w:r>
+            <w:proofErr w:type="gramEnd"/>
+            <w:r>
+              <w:t xml:space="preserve">} – </w:t>
+            </w:r>
+            <w:proofErr w:type="gramStart"/>
+            <w:r>
+              <w:t xml:space="preserve">{{ </w:t>
+            </w:r>
+            <w:proofErr w:type="spellStart"/>
+            <w:r>
+              <w:t>exp</w:t>
+            </w:r>
+            <w:proofErr w:type="gramEnd"/>
+            <w:r>
+              <w:t>.</w:t>
+            </w:r>
+            <w:proofErr w:type="gramStart"/>
+            <w:r>
+              <w:t>endDate</w:t>
+            </w:r>
+            <w:proofErr w:type="spellEnd"/>
+            <w:r>
+              <w:t xml:space="preserve"> }</w:t>
+            </w:r>
+            <w:proofErr w:type="gramEnd"/>
+            <w:r>
+              <w:t>}</w:t>
             </w:r>
           </w:p>
           <w:p>
             <w:r>
-              <w:t>Position/Title: {{ exp.title }}</w:t>
+              <w:t xml:space="preserve">Position/Title: </w:t>
+            </w:r>
+            <w:proofErr w:type="gramStart"/>
+            <w:r>
+              <w:t xml:space="preserve">{{ </w:t>
+            </w:r>
+            <w:proofErr w:type="spellStart"/>
+            <w:r>
+              <w:t>exp</w:t>
+            </w:r>
+            <w:proofErr w:type="gramEnd"/>
+            <w:r>
+              <w:t>.</w:t>
+            </w:r>
+            <w:proofErr w:type="gramStart"/>
+            <w:r>
+              <w:t>title</w:t>
+            </w:r>
+            <w:proofErr w:type="spellEnd"/>
+            <w:r>
+              <w:t xml:space="preserve"> }</w:t>
+            </w:r>
+            <w:proofErr w:type="gramEnd"/>
+            <w:r>
+              <w:t>}</w:t>
             </w:r>
           </w:p>
           <w:p>
             <w:r>
-              <w:t>Primary Responsibilities:</w:t>
+              <w:t xml:space="preserve">Client: </w:t>
+            </w:r>
+            <w:proofErr w:type="gramStart"/>
+            <w:r>
+              <w:t xml:space="preserve">{{ </w:t>
+            </w:r>
+            <w:proofErr w:type="spellStart"/>
+            <w:r>
+              <w:t>exp</w:t>
+            </w:r>
+            <w:proofErr w:type="gramEnd"/>
+            <w:r>
+              <w:t>.</w:t>
+            </w:r>
+            <w:proofErr w:type="gramStart"/>
+            <w:r>
+              <w:t>clients</w:t>
+            </w:r>
+            <w:proofErr w:type="spellEnd"/>
+            <w:r>
+              <w:t xml:space="preserve"> }</w:t>
+            </w:r>
+            <w:proofErr w:type="gramEnd"/>
+            <w:r>
+              <w:t>}</w:t>
             </w:r>
           </w:p>
           <w:p>
             <w:r>
-              <w:t>{%p for item in exp.</w:t>
+              <w:t xml:space="preserve">Project Name: </w:t>
+            </w:r>
+            <w:proofErr w:type="gramStart"/>
+            <w:r>
+              <w:t xml:space="preserve">{{ </w:t>
+            </w:r>
+            <w:proofErr w:type="spellStart"/>
+            <w:r>
+              <w:t>exp</w:t>
+            </w:r>
+            <w:proofErr w:type="gramEnd"/>
+            <w:r>
+              <w:t>.</w:t>
+            </w:r>
+            <w:proofErr w:type="gramStart"/>
+            <w:r>
+              <w:t>projectName</w:t>
+            </w:r>
+            <w:proofErr w:type="spellEnd"/>
+            <w:r>
+              <w:t xml:space="preserve"> }</w:t>
+            </w:r>
+            <w:proofErr w:type="gramEnd"/>
+            <w:r>
+              <w:t>}</w:t>
+            </w:r>
+          </w:p>
+          <w:p>
+            <w:r>
+              <w:t xml:space="preserve">Project Description: </w:t>
+            </w:r>
+            <w:proofErr w:type="gramStart"/>
+            <w:r>
+              <w:t xml:space="preserve">{{ </w:t>
+            </w:r>
+            <w:proofErr w:type="spellStart"/>
+            <w:r>
+              <w:t>exp</w:t>
+            </w:r>
+            <w:proofErr w:type="gramEnd"/>
+            <w:r>
+              <w:t>.</w:t>
+            </w:r>
+            <w:proofErr w:type="gramStart"/>
+            <w:r>
+              <w:t>projectDescription</w:t>
+            </w:r>
+            <w:proofErr w:type="spellEnd"/>
+            <w:r>
+              <w:t xml:space="preserve"> }</w:t>
+            </w:r>
+            <w:proofErr w:type="gramEnd"/>
+            <w:r>
+              <w:t>}</w:t>
+            </w:r>
+          </w:p>
+          <w:p>
+            <w:r>
+              <w:t>Primary Responsibilities:</w:t>
+            </w:r>
+          </w:p>
+          <w:p>
+            <w:r>
+              <w:t xml:space="preserve">{%p for item in </w:t>
+            </w:r>
+            <w:proofErr w:type="spellStart"/>
+            <w:proofErr w:type="gramStart"/>
+            <w:r>
+              <w:t>exp.</w:t>
             </w:r>
             <w:r>
               <w:t>achievements</w:t>
             </w:r>
+            <w:proofErr w:type="spellEnd"/>
+            <w:proofErr w:type="gramEnd"/>
             <w:r>
               <w:t xml:space="preserve"> %}</w:t>
             </w:r>
@@ -429,20 +793,45 @@
                 <w:numId w:val="1"/>
               </w:numPr>
             </w:pPr>
-            <w:r>
-              <w:t>{{ item }}</w:t>
+            <w:proofErr w:type="gramStart"/>
+            <w:r>
+              <w:t>{{ item</w:t>
+            </w:r>
+            <w:proofErr w:type="gramEnd"/>
+            <w:r>
+              <w:t xml:space="preserve"> }}</w:t>
             </w:r>
           </w:p>
           <w:p>
             <w:r>
-              <w:t>{%p endfor %}</w:t>
-            </w:r>
+              <w:t xml:space="preserve">{%p </w:t>
+            </w:r>
+            <w:proofErr w:type="spellStart"/>
+            <w:proofErr w:type="gramStart"/>
+            <w:r>
+              <w:t>endfor</w:t>
+            </w:r>
+            <w:proofErr w:type="spellEnd"/>
+            <w:r>
+              <w:t xml:space="preserve"> %}</w:t>
+            </w:r>
+            <w:proofErr w:type="gramEnd"/>
           </w:p>
           <w:p/>
           <w:p>
             <w:r>
-              <w:t>{%p endfor %}</w:t>
-            </w:r>
+              <w:t xml:space="preserve">{%p </w:t>
+            </w:r>
+            <w:proofErr w:type="spellStart"/>
+            <w:proofErr w:type="gramStart"/>
+            <w:r>
+              <w:t>endfor</w:t>
+            </w:r>
+            <w:proofErr w:type="spellEnd"/>
+            <w:r>
+              <w:t xml:space="preserve"> %}</w:t>
+            </w:r>
+            <w:proofErr w:type="gramEnd"/>
           </w:p>
           <w:p/>
           <w:p>
@@ -456,23 +845,95 @@
           </w:p>
           <w:p>
             <w:r>
-              <w:t>{%p for education in education %}</w:t>
-            </w:r>
+              <w:t xml:space="preserve">{%p for education in </w:t>
+            </w:r>
+            <w:proofErr w:type="gramStart"/>
+            <w:r>
+              <w:t>education %}</w:t>
+            </w:r>
+            <w:proofErr w:type="gramEnd"/>
           </w:p>
           <w:p>
             <w:r>
-              <w:t>Institution: {{ education.degree }}</w:t>
+              <w:t xml:space="preserve">Institution: </w:t>
+            </w:r>
+            <w:proofErr w:type="gramStart"/>
+            <w:r>
+              <w:t>{{ education</w:t>
+            </w:r>
+            <w:proofErr w:type="gramEnd"/>
+            <w:r>
+              <w:t>.</w:t>
+            </w:r>
+            <w:r>
+              <w:t xml:space="preserve"> </w:t>
+            </w:r>
+            <w:proofErr w:type="gramStart"/>
+            <w:r>
+              <w:t>institution</w:t>
+            </w:r>
+            <w:r>
+              <w:t xml:space="preserve"> </w:t>
+            </w:r>
+            <w:r>
+              <w:t>}</w:t>
+            </w:r>
+            <w:proofErr w:type="gramEnd"/>
+            <w:r>
+              <w:t>}</w:t>
             </w:r>
           </w:p>
           <w:p>
             <w:r>
-              <w:t>Result/Degree: {{ education.field }}</w:t>
+              <w:t xml:space="preserve">Result/Degree: </w:t>
+            </w:r>
+            <w:proofErr w:type="gramStart"/>
+            <w:r>
+              <w:t xml:space="preserve">{{ </w:t>
+            </w:r>
+            <w:proofErr w:type="spellStart"/>
+            <w:r>
+              <w:t>education</w:t>
+            </w:r>
+            <w:proofErr w:type="gramEnd"/>
+            <w:r>
+              <w:t>.degree</w:t>
+            </w:r>
+            <w:proofErr w:type="spellEnd"/>
+            <w:r>
+              <w:t xml:space="preserve"> </w:t>
+            </w:r>
+            <w:r>
+              <w:t>|</w:t>
+            </w:r>
+            <w:r>
+              <w:t xml:space="preserve"> </w:t>
+            </w:r>
+            <w:proofErr w:type="spellStart"/>
+            <w:proofErr w:type="gramStart"/>
+            <w:r>
+              <w:t>education.field</w:t>
+            </w:r>
+            <w:proofErr w:type="spellEnd"/>
+            <w:proofErr w:type="gramEnd"/>
+            <w:r>
+              <w:t xml:space="preserve"> }}</w:t>
             </w:r>
           </w:p>
           <w:p>
             <w:r>
-              <w:t>{%p endfor %}</w:t>
-            </w:r>
+              <w:t xml:space="preserve">{%p </w:t>
+            </w:r>
+            <w:proofErr w:type="spellStart"/>
+            <w:proofErr w:type="gramStart"/>
+            <w:r>
+              <w:t>endfor</w:t>
+            </w:r>
+            <w:proofErr w:type="spellEnd"/>
+            <w:r>
+              <w:t xml:space="preserve"> %}</w:t>
+            </w:r>
+            <w:proofErr w:type="gramEnd"/>
           </w:p>
           <w:p>
             <w:pPr>
@@ -485,7 +946,6 @@
           </w:p>
           <w:p>
             <w:pPr>
-              <w:spacing w:after="0" w:line="240" w:lineRule="auto"/>
               <w:rPr>
                 <w:rFonts w:ascii="Arial" w:hAnsi="Arial" w:cs="Arial"/>
                 <w:sz w:val="22"/>
@@ -498,43 +958,176 @@
                 <w:sz w:val="22"/>
                 <w:szCs w:val="22"/>
               </w:rPr>
-              <w:t>White Papers:</w:t>
-            </w:r>
-            <w:r>
+              <w:t>Certifications:</w:t>
+            </w:r>
+          </w:p>
+          <w:p>
+            <w:pPr>
               <w:rPr>
                 <w:rFonts w:ascii="Arial" w:hAnsi="Arial" w:cs="Arial"/>
                 <w:sz w:val="22"/>
                 <w:szCs w:val="22"/>
               </w:rPr>
-              <w:t xml:space="preserve"> </w:t>
-            </w:r>
+            </w:pPr>
             <w:r>
               <w:rPr>
                 <w:rFonts w:ascii="Arial" w:hAnsi="Arial" w:cs="Arial"/>
                 <w:sz w:val="22"/>
                 <w:szCs w:val="22"/>
               </w:rPr>
-              <w:t>{{ linkedin }}</w:t>
-            </w:r>
-          </w:p>
-          <w:p>
+              <w:t xml:space="preserve">{%p for cert in </w:t>
+            </w:r>
+            <w:proofErr w:type="gramStart"/>
             <w:r>
               <w:rPr>
                 <w:rFonts w:ascii="Arial" w:hAnsi="Arial" w:cs="Arial"/>
                 <w:sz w:val="22"/>
                 <w:szCs w:val="22"/>
               </w:rPr>
-              <w:t>Memberships</w:t>
-            </w:r>
-            <w:r>
+              <w:t>certifications %}</w:t>
+            </w:r>
+            <w:proofErr w:type="gramEnd"/>
+          </w:p>
+          <w:p>
+            <w:pPr>
+              <w:pStyle w:val="ListParagraph"/>
+              <w:numPr>
+                <w:ilvl w:val="0"/>
+                <w:numId w:val="1"/>
+              </w:numPr>
               <w:rPr>
                 <w:rFonts w:ascii="Arial" w:hAnsi="Arial" w:cs="Arial"/>
                 <w:sz w:val="22"/>
                 <w:szCs w:val="22"/>
               </w:rPr>
-              <w:t>:</w:t>
+            </w:pPr>
+            <w:proofErr w:type="gramStart"/>
+            <w:r>
+              <w:rPr>
+                <w:rFonts w:ascii="Arial" w:hAnsi="Arial" w:cs="Arial"/>
+                <w:sz w:val="22"/>
+                <w:szCs w:val="22"/>
+              </w:rPr>
+              <w:t>{{ cert.name</w:t>
+            </w:r>
+            <w:proofErr w:type="gramEnd"/>
+            <w:r>
+              <w:rPr>
+                <w:rFonts w:ascii="Arial" w:hAnsi="Arial" w:cs="Arial"/>
+                <w:sz w:val="22"/>
+                <w:szCs w:val="22"/>
+              </w:rPr>
+              <w:t xml:space="preserve"> }} </w:t>
+            </w:r>
+            <w:r>
+              <w:rPr>
+                <w:rFonts w:ascii="Arial" w:hAnsi="Arial" w:cs="Arial"/>
+                <w:sz w:val="22"/>
+                <w:szCs w:val="22"/>
+              </w:rPr>
+              <w:t>|</w:t>
+            </w:r>
+            <w:r>
+              <w:rPr>
+                <w:rFonts w:ascii="Arial" w:hAnsi="Arial" w:cs="Arial"/>
+                <w:sz w:val="22"/>
+                <w:szCs w:val="22"/>
+              </w:rPr>
+              <w:t xml:space="preserve"> Issuer- </w:t>
+            </w:r>
+            <w:proofErr w:type="gramStart"/>
+            <w:r>
+              <w:rPr>
+                <w:rFonts w:ascii="Arial" w:hAnsi="Arial" w:cs="Arial"/>
+                <w:sz w:val="22"/>
+                <w:szCs w:val="22"/>
+              </w:rPr>
+              <w:t xml:space="preserve">{{ </w:t>
+            </w:r>
+            <w:proofErr w:type="spellStart"/>
+            <w:r>
+              <w:rPr>
+                <w:rFonts w:ascii="Arial" w:hAnsi="Arial" w:cs="Arial"/>
+                <w:sz w:val="22"/>
+                <w:szCs w:val="22"/>
+              </w:rPr>
+              <w:t>cert</w:t>
+            </w:r>
+            <w:proofErr w:type="gramEnd"/>
+            <w:r>
+              <w:rPr>
+                <w:rFonts w:ascii="Arial" w:hAnsi="Arial" w:cs="Arial"/>
+                <w:sz w:val="22"/>
+                <w:szCs w:val="22"/>
+              </w:rPr>
+              <w:t>.</w:t>
+            </w:r>
+            <w:proofErr w:type="gramStart"/>
+            <w:r>
+              <w:rPr>
+                <w:rFonts w:ascii="Arial" w:hAnsi="Arial" w:cs="Arial"/>
+                <w:sz w:val="22"/>
+                <w:szCs w:val="22"/>
+              </w:rPr>
+              <w:t>issuer</w:t>
+            </w:r>
+            <w:proofErr w:type="spellEnd"/>
+            <w:r>
+              <w:rPr>
+                <w:rFonts w:ascii="Arial" w:hAnsi="Arial" w:cs="Arial"/>
+                <w:sz w:val="22"/>
+                <w:szCs w:val="22"/>
+              </w:rPr>
+              <w:t xml:space="preserve"> }</w:t>
+            </w:r>
+            <w:proofErr w:type="gramEnd"/>
+            <w:r>
+              <w:rPr>
+                <w:rFonts w:ascii="Arial" w:hAnsi="Arial" w:cs="Arial"/>
+                <w:sz w:val="22"/>
+                <w:szCs w:val="22"/>
+              </w:rPr>
+              <w:t>}</w:t>
             </w:r>
           </w:p>
+          <w:p>
+            <w:pPr>
+              <w:rPr>
+                <w:rFonts w:ascii="Arial" w:hAnsi="Arial" w:cs="Arial"/>
+                <w:sz w:val="22"/>
+                <w:szCs w:val="22"/>
+              </w:rPr>
+            </w:pPr>
+            <w:r>
+              <w:rPr>
+                <w:rFonts w:ascii="Arial" w:hAnsi="Arial" w:cs="Arial"/>
+                <w:sz w:val="22"/>
+                <w:szCs w:val="22"/>
+              </w:rPr>
+              <w:t xml:space="preserve">{%p </w:t>
+            </w:r>
+            <w:proofErr w:type="spellStart"/>
+            <w:proofErr w:type="gramStart"/>
+            <w:r>
+              <w:rPr>
+                <w:rFonts w:ascii="Arial" w:hAnsi="Arial" w:cs="Arial"/>
+                <w:sz w:val="22"/>
+                <w:szCs w:val="22"/>
+              </w:rPr>
+              <w:t>endfor</w:t>
+            </w:r>
+            <w:proofErr w:type="spellEnd"/>
+            <w:r>
+              <w:rPr>
+                <w:rFonts w:ascii="Arial" w:hAnsi="Arial" w:cs="Arial"/>
+                <w:sz w:val="22"/>
+                <w:szCs w:val="22"/>
+              </w:rPr>
+              <w:t xml:space="preserve"> %}</w:t>
+            </w:r>
+            <w:proofErr w:type="gramEnd"/>
+          </w:p>
+          <w:p/>
           <w:p/>
           <w:tbl>
             <w:tblPr>
@@ -3408,7 +4001,7 @@
   <w:abstractNum w:abstractNumId="22" w15:restartNumberingAfterBreak="0">
     <w:nsid w:val="76F904B4"/>
     <w:multiLevelType w:val="hybridMultilevel"/>
-    <w:tmpl w:val="5310123E"/>
+    <w:tmpl w:val="8D2C3EDA"/>
     <w:lvl w:ilvl="0" w:tplc="04090001">
       <w:start w:val="1"/>
       <w:numFmt w:val="bullet"/>
@@ -4429,6 +5022,7 @@
   <w:style w:type="character" w:default="1" w:styleId="DefaultParagraphFont">
     <w:name w:val="Default Paragraph Font"/>
     <w:uiPriority w:val="1"/>
+    <w:semiHidden/>
     <w:unhideWhenUsed/>
   </w:style>
   <w:style w:type="table" w:default="1" w:styleId="TableNormal">

</xml_diff>

<commit_message>
changes for formating docx
</commit_message>
<xml_diff>
--- a/backend/template/NTT_DATA_Master_Templates.docx
+++ b/backend/template/NTT_DATA_Master_Templates.docx
@@ -4,6 +4,7 @@
   <w:body>
     <w:tbl>
       <w:tblPr>
+        <w:tblpPr w:leftFromText="180" w:rightFromText="180" w:horzAnchor="margin" w:tblpY="435"/>
         <w:tblW w:w="5074" w:type="pct"/>
         <w:tblCellSpacing w:w="0" w:type="dxa"/>
         <w:tblLayout w:type="fixed"/>
@@ -26,6 +27,9 @@
             <w:tcW w:w="5000" w:type="pct"/>
           </w:tcPr>
           <w:p>
+            <w:pPr>
+              <w:jc w:val="center"/>
+            </w:pPr>
             <w:r>
               <w:rPr>
                 <w:noProof/>
@@ -77,6 +81,7 @@
             <w:pPr>
               <w:pStyle w:val="Heading2"/>
               <w:spacing w:line="240" w:lineRule="auto"/>
+              <w:jc w:val="center"/>
             </w:pPr>
             <w:proofErr w:type="gramStart"/>
             <w:r>
@@ -90,14 +95,12 @@
             <w:proofErr w:type="gramEnd"/>
             <w:r>
               <w:t xml:space="preserve"> }}</w:t>
-            </w:r>
-            <w:r>
-              <w:t xml:space="preserve"> </w:t>
             </w:r>
           </w:p>
           <w:p>
             <w:pPr>
               <w:pStyle w:val="Heading2"/>
+              <w:jc w:val="center"/>
             </w:pPr>
             <w:proofErr w:type="gramStart"/>
             <w:r>
@@ -117,6 +120,9 @@
             </w:r>
           </w:p>
           <w:p>
+            <w:pPr>
+              <w:jc w:val="center"/>
+            </w:pPr>
             <w:proofErr w:type="gramStart"/>
             <w:r>
               <w:t>{{ email</w:t>
@@ -125,8 +131,58 @@
             <w:r>
               <w:t xml:space="preserve"> }}</w:t>
             </w:r>
-          </w:p>
-          <w:p>
+            <w:r>
+              <w:t xml:space="preserve"> | </w:t>
+            </w:r>
+            <w:r>
+              <w:rPr>
+                <w:noProof/>
+              </w:rPr>
+              <w:drawing>
+                <wp:inline distT="0" distB="0" distL="0" distR="0" wp14:anchorId="6545601C" wp14:editId="5C13738D">
+                  <wp:extent cx="155944" cy="155944"/>
+                  <wp:effectExtent l="0" t="0" r="0" b="0"/>
+                  <wp:docPr id="1473499191" name="Graphic 2" descr="Smart Phone with solid fill"/>
+                  <wp:cNvGraphicFramePr>
+                    <a:graphicFrameLocks xmlns:a="http://schemas.openxmlformats.org/drawingml/2006/main" noChangeAspect="1"/>
+                  </wp:cNvGraphicFramePr>
+                  <a:graphic xmlns:a="http://schemas.openxmlformats.org/drawingml/2006/main">
+                    <a:graphicData uri="http://schemas.openxmlformats.org/drawingml/2006/picture">
+                      <pic:pic xmlns:pic="http://schemas.openxmlformats.org/drawingml/2006/picture">
+                        <pic:nvPicPr>
+                          <pic:cNvPr id="1473499191" name="Graphic 1473499191" descr="Smart Phone with solid fill"/>
+                          <pic:cNvPicPr/>
+                        </pic:nvPicPr>
+                        <pic:blipFill>
+                          <a:blip r:embed="rId11">
+                            <a:extLst>
+                              <a:ext uri="{96DAC541-7B7A-43D3-8B79-37D633B846F1}">
+                                <asvg:svgBlip xmlns:asvg="http://schemas.microsoft.com/office/drawing/2016/SVG/main" r:embed="rId12"/>
+                              </a:ext>
+                            </a:extLst>
+                          </a:blip>
+                          <a:stretch>
+                            <a:fillRect/>
+                          </a:stretch>
+                        </pic:blipFill>
+                        <pic:spPr>
+                          <a:xfrm flipV="1">
+                            <a:off x="0" y="0"/>
+                            <a:ext cx="159816" cy="159816"/>
+                          </a:xfrm>
+                          <a:prstGeom prst="rect">
+                            <a:avLst/>
+                          </a:prstGeom>
+                        </pic:spPr>
+                      </pic:pic>
+                    </a:graphicData>
+                  </a:graphic>
+                </wp:inline>
+              </w:drawing>
+            </w:r>
+            <w:r>
+              <w:t xml:space="preserve">- </w:t>
+            </w:r>
             <w:proofErr w:type="gramStart"/>
             <w:r>
               <w:t xml:space="preserve">{{ </w:t>
@@ -143,6 +199,7 @@
             <w:pPr>
               <w:pStyle w:val="Style2"/>
               <w:spacing w:line="240" w:lineRule="auto"/>
+              <w:jc w:val="center"/>
               <w:rPr>
                 <w:rFonts w:ascii="Arial" w:hAnsi="Arial" w:cs="Arial"/>
                 <w:sz w:val="22"/>
@@ -167,14 +224,6 @@
               </w:rPr>
               <w:t xml:space="preserve"> }}</w:t>
             </w:r>
-            <w:r>
-              <w:rPr>
-                <w:rFonts w:ascii="Arial" w:hAnsi="Arial" w:cs="Arial"/>
-                <w:sz w:val="22"/>
-                <w:szCs w:val="22"/>
-              </w:rPr>
-              <w:t xml:space="preserve"> </w:t>
-            </w:r>
           </w:p>
           <w:p>
             <w:pPr>
@@ -187,16 +236,16 @@
               <mc:AlternateContent>
                 <mc:Choice Requires="wps">
                   <w:drawing>
-                    <wp:anchor distT="0" distB="0" distL="114300" distR="114300" simplePos="0" relativeHeight="251661312" behindDoc="0" locked="0" layoutInCell="1" allowOverlap="1" wp14:anchorId="1F9E9817" wp14:editId="223D7ECD">
+                    <wp:anchor distT="0" distB="0" distL="114300" distR="114300" simplePos="0" relativeHeight="251661312" behindDoc="0" locked="0" layoutInCell="1" allowOverlap="1" wp14:anchorId="1F9E9817" wp14:editId="5C17E943">
                       <wp:simplePos x="0" y="0"/>
                       <wp:positionH relativeFrom="column">
-                        <wp:posOffset>19050</wp:posOffset>
+                        <wp:posOffset>19567</wp:posOffset>
                       </wp:positionH>
                       <wp:positionV relativeFrom="paragraph">
-                        <wp:posOffset>77470</wp:posOffset>
+                        <wp:posOffset>73837</wp:posOffset>
                       </wp:positionV>
-                      <wp:extent cx="5886450" cy="0"/>
-                      <wp:effectExtent l="0" t="0" r="0" b="0"/>
+                      <wp:extent cx="12872484" cy="7089"/>
+                      <wp:effectExtent l="0" t="0" r="24765" b="31115"/>
                       <wp:wrapNone/>
                       <wp:docPr id="1579917763" name="Straight Connector 2"/>
                       <wp:cNvGraphicFramePr/>
@@ -205,9 +254,9 @@
                           <wps:wsp>
                             <wps:cNvCnPr/>
                             <wps:spPr>
-                              <a:xfrm>
+                              <a:xfrm flipV="1">
                                 <a:off x="0" y="0"/>
-                                <a:ext cx="5886450" cy="0"/>
+                                <a:ext cx="12872484" cy="7089"/>
                               </a:xfrm>
                               <a:prstGeom prst="line">
                                 <a:avLst/>
@@ -231,12 +280,18 @@
                           </wps:wsp>
                         </a:graphicData>
                       </a:graphic>
+                      <wp14:sizeRelH relativeFrom="margin">
+                        <wp14:pctWidth>0</wp14:pctWidth>
+                      </wp14:sizeRelH>
+                      <wp14:sizeRelV relativeFrom="margin">
+                        <wp14:pctHeight>0</wp14:pctHeight>
+                      </wp14:sizeRelV>
                     </wp:anchor>
                   </w:drawing>
                 </mc:Choice>
                 <mc:Fallback>
                   <w:pict>
-                    <v:line w14:anchorId="699B2459" id="Straight Connector 2" o:spid="_x0000_s1026" style="position:absolute;z-index:251661312;visibility:visible;mso-wrap-style:square;mso-wrap-distance-left:9pt;mso-wrap-distance-top:0;mso-wrap-distance-right:9pt;mso-wrap-distance-bottom:0;mso-position-horizontal:absolute;mso-position-horizontal-relative:text;mso-position-vertical:absolute;mso-position-vertical-relative:text" from="1.5pt,6.1pt" to="465pt,6.1pt" o:gfxdata="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" strokecolor="black [3200]" strokeweight=".5pt">
+                    <v:line w14:anchorId="5450DA70" id="Straight Connector 2" o:spid="_x0000_s1026" style="position:absolute;flip:y;z-index:251661312;visibility:visible;mso-wrap-style:square;mso-width-percent:0;mso-height-percent:0;mso-wrap-distance-left:9pt;mso-wrap-distance-top:0;mso-wrap-distance-right:9pt;mso-wrap-distance-bottom:0;mso-position-horizontal:absolute;mso-position-horizontal-relative:text;mso-position-vertical:absolute;mso-position-vertical-relative:text;mso-width-percent:0;mso-height-percent:0;mso-width-relative:margin;mso-height-relative:margin" from="1.55pt,5.8pt" to="1015.15pt,6.35pt" o:gfxdata="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" strokecolor="black [3200]" strokeweight=".5pt">
                       <v:stroke joinstyle="miter"/>
                     </v:line>
                   </w:pict>
@@ -386,6 +441,7 @@
                 <w:p>
                   <w:pPr>
                     <w:pStyle w:val="Heading2"/>
+                    <w:framePr w:hSpace="180" w:wrap="around" w:hAnchor="margin" w:y="435"/>
                     <w:spacing w:before="0" w:after="0" w:line="240" w:lineRule="auto"/>
                   </w:pPr>
                   <w:r>
@@ -393,6 +449,9 @@
                   </w:r>
                 </w:p>
                 <w:p>
+                  <w:pPr>
+                    <w:framePr w:hSpace="180" w:wrap="around" w:hAnchor="margin" w:y="435"/>
+                  </w:pPr>
                   <w:r>
                     <w:t xml:space="preserve">{%p for skill in </w:t>
                   </w:r>
@@ -413,6 +472,7 @@
                 <w:p>
                   <w:pPr>
                     <w:pStyle w:val="ListParagraph"/>
+                    <w:framePr w:hSpace="180" w:wrap="around" w:hAnchor="margin" w:y="435"/>
                     <w:numPr>
                       <w:ilvl w:val="0"/>
                       <w:numId w:val="25"/>
@@ -444,6 +504,9 @@
                   </w:r>
                 </w:p>
                 <w:p>
+                  <w:pPr>
+                    <w:framePr w:hSpace="180" w:wrap="around" w:hAnchor="margin" w:y="435"/>
+                  </w:pPr>
                   <w:r>
                     <w:t xml:space="preserve">{%p </w:t>
                   </w:r>
@@ -461,6 +524,7 @@
                 <w:p>
                   <w:pPr>
                     <w:pStyle w:val="Heading2"/>
+                    <w:framePr w:hSpace="180" w:wrap="around" w:hAnchor="margin" w:y="435"/>
                     <w:spacing w:before="0" w:after="0" w:line="240" w:lineRule="auto"/>
                   </w:pPr>
                   <w:r>
@@ -468,6 +532,9 @@
                   </w:r>
                 </w:p>
                 <w:p>
+                  <w:pPr>
+                    <w:framePr w:hSpace="180" w:wrap="around" w:hAnchor="margin" w:y="435"/>
+                  </w:pPr>
                   <w:r>
                     <w:t xml:space="preserve">{%p for skill in </w:t>
                   </w:r>
@@ -488,6 +555,7 @@
                 <w:p>
                   <w:pPr>
                     <w:pStyle w:val="ListParagraph"/>
+                    <w:framePr w:hSpace="180" w:wrap="around" w:hAnchor="margin" w:y="435"/>
                     <w:numPr>
                       <w:ilvl w:val="0"/>
                       <w:numId w:val="25"/>
@@ -519,6 +587,9 @@
                   </w:r>
                 </w:p>
                 <w:p>
+                  <w:pPr>
+                    <w:framePr w:hSpace="180" w:wrap="around" w:hAnchor="margin" w:y="435"/>
+                  </w:pPr>
                   <w:r>
                     <w:t xml:space="preserve">{%p </w:t>
                   </w:r>
@@ -533,7 +604,11 @@
                   </w:r>
                   <w:proofErr w:type="gramEnd"/>
                 </w:p>
-                <w:p/>
+                <w:p>
+                  <w:pPr>
+                    <w:framePr w:hSpace="180" w:wrap="around" w:hAnchor="margin" w:y="435"/>
+                  </w:pPr>
+                </w:p>
               </w:tc>
             </w:tr>
           </w:tbl>
@@ -1216,9 +1291,14 @@
                 <w:tcPr>
                   <w:tcW w:w="9030" w:type="dxa"/>
                 </w:tcPr>
-                <w:p/>
                 <w:p>
                   <w:pPr>
+                    <w:framePr w:hSpace="180" w:wrap="around" w:hAnchor="margin" w:y="435"/>
+                  </w:pPr>
+                </w:p>
+                <w:p>
+                  <w:pPr>
+                    <w:framePr w:hSpace="180" w:wrap="around" w:hAnchor="margin" w:y="435"/>
                     <w:spacing w:after="0" w:line="240" w:lineRule="auto"/>
                     <w:rPr>
                       <w:rFonts w:ascii="Arial" w:hAnsi="Arial" w:cs="Arial"/>
@@ -1254,6 +1334,7 @@
                       </w:tcPr>
                       <w:p>
                         <w:pPr>
+                          <w:framePr w:hSpace="180" w:wrap="around" w:hAnchor="margin" w:y="435"/>
                           <w:spacing w:after="0" w:line="240" w:lineRule="auto"/>
                           <w:rPr>
                             <w:rFonts w:ascii="Arial" w:hAnsi="Arial" w:cs="Arial"/>
@@ -1270,6 +1351,7 @@
                       </w:tcPr>
                       <w:p>
                         <w:pPr>
+                          <w:framePr w:hSpace="180" w:wrap="around" w:hAnchor="margin" w:y="435"/>
                           <w:spacing w:after="0" w:line="240" w:lineRule="auto"/>
                           <w:rPr>
                             <w:rFonts w:ascii="Arial" w:hAnsi="Arial" w:cs="Arial"/>
@@ -1293,6 +1375,7 @@
                       </w:tcPr>
                       <w:p>
                         <w:pPr>
+                          <w:framePr w:hSpace="180" w:wrap="around" w:hAnchor="margin" w:y="435"/>
                           <w:spacing w:after="0" w:line="360" w:lineRule="auto"/>
                           <w:rPr>
                             <w:rFonts w:ascii="Arial" w:hAnsi="Arial" w:cs="Arial"/>
@@ -1306,6 +1389,7 @@
                 </w:tbl>
                 <w:p>
                   <w:pPr>
+                    <w:framePr w:hSpace="180" w:wrap="around" w:hAnchor="margin" w:y="435"/>
                     <w:spacing w:after="0" w:line="240" w:lineRule="auto"/>
                     <w:rPr>
                       <w:rFonts w:ascii="Arial" w:hAnsi="Arial" w:cs="Arial"/>
@@ -1327,6 +1411,7 @@
                 </w:tcPr>
                 <w:p>
                   <w:pPr>
+                    <w:framePr w:hSpace="180" w:wrap="around" w:hAnchor="margin" w:y="435"/>
                     <w:spacing w:after="0" w:line="240" w:lineRule="auto"/>
                     <w:rPr>
                       <w:rFonts w:ascii="Arial" w:hAnsi="Arial" w:cs="Arial"/>
@@ -1358,8 +1443,8 @@
       </w:pPr>
     </w:p>
     <w:sectPr>
-      <w:headerReference w:type="default" r:id="rId11"/>
-      <w:footerReference w:type="default" r:id="rId12"/>
+      <w:headerReference w:type="default" r:id="rId13"/>
+      <w:footerReference w:type="default" r:id="rId14"/>
       <w:pgSz w:w="12240" w:h="15840"/>
       <w:pgMar w:top="1440" w:right="1440" w:bottom="1440" w:left="1440" w:header="708" w:footer="708" w:gutter="0"/>
       <w:cols w:space="708"/>

</xml_diff>